<commit_message>
decoding compiler formated upto 1to 9
</commit_message>
<xml_diff>
--- a/sparkReport.docx
+++ b/sparkReport.docx
@@ -3904,7 +3904,21 @@
                 <w:rFonts w:ascii="Times New Roman" w:eastAsia="Times New Roman" w:hAnsi="Times New Roman" w:cs="Times New Roman"/>
                 <w:color w:val="000000"/>
               </w:rPr>
-              <w:t>Student Name Student ID:</w:t>
+              <w:t xml:space="preserve">Md. Sajib Ahmed   </w:t>
+            </w:r>
+            <w:r>
+              <w:rPr>
+                <w:rFonts w:ascii="Times New Roman" w:eastAsia="Times New Roman" w:hAnsi="Times New Roman" w:cs="Times New Roman"/>
+                <w:color w:val="000000"/>
+              </w:rPr>
+              <w:t xml:space="preserve"> ID:</w:t>
+            </w:r>
+            <w:r>
+              <w:rPr>
+                <w:rFonts w:ascii="Times New Roman" w:eastAsia="Times New Roman" w:hAnsi="Times New Roman" w:cs="Times New Roman"/>
+                <w:color w:val="000000"/>
+              </w:rPr>
+              <w:t xml:space="preserve"> 241-15-832</w:t>
             </w:r>
           </w:p>
           <w:p>
@@ -13566,15 +13580,7 @@
                               <w:color w:val="000000"/>
                               <w:sz w:val="28"/>
                             </w:rPr>
-                            <w:t xml:space="preserve"> </w:t>
-                          </w:r>
-                          <w:r>
-                            <w:rPr>
-                              <w:rFonts w:ascii="Times New Roman" w:eastAsia="Times New Roman" w:hAnsi="Times New Roman" w:cs="Times New Roman"/>
-                              <w:color w:val="000000"/>
-                              <w:sz w:val="28"/>
-                            </w:rPr>
-                            <w:t>PAGE  \* roman iii</w:t>
+                            <w:t xml:space="preserve"> PAGE  \* roman iii</w:t>
                           </w:r>
                         </w:p>
                       </w:txbxContent>
@@ -13605,15 +13611,7 @@
                         <w:color w:val="000000"/>
                         <w:sz w:val="28"/>
                       </w:rPr>
-                      <w:t xml:space="preserve"> </w:t>
-                    </w:r>
-                    <w:r>
-                      <w:rPr>
-                        <w:rFonts w:ascii="Times New Roman" w:eastAsia="Times New Roman" w:hAnsi="Times New Roman" w:cs="Times New Roman"/>
-                        <w:color w:val="000000"/>
-                        <w:sz w:val="28"/>
-                      </w:rPr>
-                      <w:t>PAGE  \* roman iii</w:t>
+                      <w:t xml:space="preserve"> PAGE  \* roman iii</w:t>
                     </w:r>
                   </w:p>
                 </w:txbxContent>
@@ -16954,28 +16952,28 @@
 </file>
 
 <file path=customXml/item1.xml><?xml version="1.0" encoding="utf-8"?>
-<b:Sources xmlns:b="http://schemas.openxmlformats.org/officeDocument/2006/bibliography" xmlns="http://schemas.openxmlformats.org/officeDocument/2006/bibliography" SelectedStyle="\APASixthEditionOfficeOnline.xsl" StyleName="APA" Version="6"/>
-</file>
-
-<file path=customXml/item2.xml><?xml version="1.0" encoding="utf-8"?>
 <go:gDocsCustomXmlDataStorage xmlns:go="http://customooxmlschemas.google.com/" xmlns:r="http://schemas.openxmlformats.org/officeDocument/2006/relationships" uri="GoogleDocsCustomDataVersion2">
   <go:docsCustomData xmlns:go="http://customooxmlschemas.google.com/" roundtripDataSignature="AMtx7mgqUA3ZPqrPLShWeY9HZOOjOPwYAA==">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</go:docsCustomData>
 </go:gDocsCustomXmlDataStorage>
 </file>
 
-<file path=customXml/itemProps1.xml><?xml version="1.0" encoding="utf-8"?>
-<ds:datastoreItem xmlns:ds="http://schemas.openxmlformats.org/officeDocument/2006/customXml" ds:itemID="{1E5533D0-A4B3-45DE-9E7A-9BF3E662F9C5}">
-  <ds:schemaRefs>
-    <ds:schemaRef ds:uri="http://schemas.openxmlformats.org/officeDocument/2006/bibliography"/>
-  </ds:schemaRefs>
-</ds:datastoreItem>
+<file path=customXml/item2.xml><?xml version="1.0" encoding="utf-8"?>
+<b:Sources xmlns:b="http://schemas.openxmlformats.org/officeDocument/2006/bibliography" xmlns="http://schemas.openxmlformats.org/officeDocument/2006/bibliography" SelectedStyle="\APASixthEditionOfficeOnline.xsl" StyleName="APA" Version="6"/>
 </file>
 
-<file path=customXml/itemProps2.xml><?xml version="1.0" encoding="utf-8"?>
+<file path=customXml/itemProps1.xml><?xml version="1.0" encoding="utf-8"?>
 <ds:datastoreItem xmlns:ds="http://schemas.openxmlformats.org/officeDocument/2006/customXml" ds:itemID="{11111111-1234-1234-1234-123412341234}">
   <ds:schemaRefs>
     <ds:schemaRef ds:uri="http://customooxmlschemas.google.com/"/>
     <ds:schemaRef ds:uri="http://schemas.openxmlformats.org/officeDocument/2006/relationships"/>
   </ds:schemaRefs>
 </ds:datastoreItem>
+</file>
+
+<file path=customXml/itemProps2.xml><?xml version="1.0" encoding="utf-8"?>
+<ds:datastoreItem xmlns:ds="http://schemas.openxmlformats.org/officeDocument/2006/customXml" ds:itemID="{1E5533D0-A4B3-45DE-9E7A-9BF3E662F9C5}">
+  <ds:schemaRefs>
+    <ds:schemaRef ds:uri="http://schemas.openxmlformats.org/officeDocument/2006/bibliography"/>
+  </ds:schemaRefs>
+</ds:datastoreItem>
 </file>
</xml_diff>